<commit_message>
updated bio and case studies
</commit_message>
<xml_diff>
--- a/public/Divine_Nnaji_CV.docx
+++ b/public/Divine_Nnaji_CV.docx
@@ -70,7 +70,7 @@
           <w:rFonts w:ascii="Calibri" w:hAnsi="Calibri"/>
           <w:sz w:val="20"/>
         </w:rPr>
-        <w:t>Dynamic, results-driven Fullstack Software Engineer and AI Systems Developer with a proven record of engineering high-performance web/mobile applications, training machine learning classifiers, and orchestrating complex workflow automation pipelines. Adept at bridging the gap between rigorous technical systems and polished, pixel-perfect user interfaces. Combines expert-level fullstack proficiency in React Native, Expo, Supabase, and Next.js with solid mathematical modeling, data cleaning, and embedded-systems integrations to automate workflows, reduce operational latency, and build premium consumer products.</w:t>
+        <w:t>Dynamic, results-driven Fullstack Software Engineer and AI Builder with 3 years of hands-on experience delivering high-performance web applications, native mobile experiences, and advanced workflow automation pipelines. Adept at bridging the gap between complex mathematical systems and sterile, responsive UI/UX designs. Expertly leverages Next.js, React Native, Supabase, Express.js, n8n, and Python to automate operations, reduce system latency, and engineer premium consumer products.</w:t>
       </w:r>
     </w:p>
     <w:p>
@@ -306,7 +306,7 @@
           <w:color w:val="2D3748"/>
           <w:sz w:val="18"/>
         </w:rPr>
-        <w:t>Python, NumPy, Matplotlib, Scikit-learn, Data Science, AI Integration</w:t>
+        <w:t>Python, NumPy, Pandas, Matplotlib, Data Science, AI Integration</w:t>
       </w:r>
     </w:p>
     <w:p>
@@ -320,7 +320,7 @@
           <w:rFonts w:ascii="Calibri" w:hAnsi="Calibri"/>
           <w:sz w:val="19"/>
         </w:rPr>
-        <w:t>Execute rigorous data cleaning, engineering, and preprocessing pipelines on high-density datasets to prepare them for predictive modeling.</w:t>
+        <w:t>Cleaned and preprocessed datasets using Python, NumPy, and Pandas to ensure data integrity for modelling pipelines.</w:t>
       </w:r>
     </w:p>
     <w:p>
@@ -334,7 +334,7 @@
           <w:rFonts w:ascii="Calibri" w:hAnsi="Calibri"/>
           <w:sz w:val="19"/>
         </w:rPr>
-        <w:t>Conduct extensive exploratory data analysis (EDA) using Python, NumPy, and Matplotlib to extract key spatial and statistical insights.</w:t>
+        <w:t>Conducted exploratory data analysis (EDA) to surface patterns and inform model development decisions.</w:t>
       </w:r>
     </w:p>
     <w:p>
@@ -348,7 +348,7 @@
           <w:rFonts w:ascii="Calibri" w:hAnsi="Calibri"/>
           <w:sz w:val="19"/>
         </w:rPr>
-        <w:t>Support the development, evaluation, and tuning of machine learning models for classification and predictive analytics.</w:t>
+        <w:t>Built and evaluated machine learning models, contributing to AI integration across internal research workflows.</w:t>
       </w:r>
     </w:p>
     <w:p>
@@ -362,7 +362,7 @@
           <w:rFonts w:ascii="Calibri" w:hAnsi="Calibri"/>
           <w:sz w:val="19"/>
         </w:rPr>
-        <w:t>Gain hands-on experience in cross-functional architectures spanning data science, embedded systems, and secure network infrastructure.</w:t>
+        <w:t>Worked across data science, embedded systems, and networking domains within a government research environment.</w:t>
       </w:r>
     </w:p>
     <w:p>
@@ -380,11 +380,11 @@
           <w:color w:val="1A365D"/>
           <w:sz w:val="21"/>
         </w:rPr>
-        <w:t>Frontend Developer Trainee</w:t>
+        <w:t>Graphic Designer &amp; Web Developer (Contract/Volunteer)</w:t>
       </w:r>
       <w:r>
         <w:tab/>
-        <w:t>January 2025 – May 2025</w:t>
+        <w:t>2026 – Present</w:t>
       </w:r>
     </w:p>
     <w:p>
@@ -402,117 +402,7 @@
           <w:color w:val="718096"/>
           <w:sz w:val="19"/>
         </w:rPr>
-        <w:t>Tech Beavers</w:t>
-      </w:r>
-      <w:r>
-        <w:tab/>
-        <w:t>Lagos, Nigeria</w:t>
-      </w:r>
-    </w:p>
-    <w:p>
-      <w:pPr>
-        <w:spacing w:after="80"/>
-        <w:ind w:left="216"/>
-      </w:pPr>
-      <w:r>
-        <w:rPr>
-          <w:rFonts w:ascii="Calibri" w:hAnsi="Calibri"/>
-          <w:b/>
-          <w:i/>
-          <w:sz w:val="18"/>
-        </w:rPr>
-        <w:t xml:space="preserve">Technologies Utilized: </w:t>
-      </w:r>
-      <w:r>
-        <w:rPr>
-          <w:rFonts w:ascii="Calibri" w:hAnsi="Calibri"/>
-          <w:i/>
-          <w:color w:val="2D3748"/>
-          <w:sz w:val="18"/>
-        </w:rPr>
-        <w:t>JavaScript, React, HTML5, CSS3, CI/CD, Git, GitHub</w:t>
-      </w:r>
-    </w:p>
-    <w:p>
-      <w:pPr>
-        <w:pStyle w:val="ListBullet"/>
-        <w:spacing w:after="50" w:line="276" w:lineRule="auto"/>
-        <w:ind w:left="432"/>
-      </w:pPr>
-      <w:r>
-        <w:rPr>
-          <w:rFonts w:ascii="Calibri" w:hAnsi="Calibri"/>
-          <w:sz w:val="19"/>
-        </w:rPr>
-        <w:t>Contributed actively to the development and maintenance of the company's enterprise-level website, optimizing performance and code readability.</w:t>
-      </w:r>
-    </w:p>
-    <w:p>
-      <w:pPr>
-        <w:pStyle w:val="ListBullet"/>
-        <w:spacing w:after="50" w:line="276" w:lineRule="auto"/>
-        <w:ind w:left="432"/>
-      </w:pPr>
-      <w:r>
-        <w:rPr>
-          <w:rFonts w:ascii="Calibri" w:hAnsi="Calibri"/>
-          <w:sz w:val="19"/>
-        </w:rPr>
-        <w:t>Managed routine CI/CD pipeline deployments, resolving tracked repository bugs via standard ticketing systems and Git branching protocols.</w:t>
-      </w:r>
-    </w:p>
-    <w:p>
-      <w:pPr>
-        <w:pStyle w:val="ListBullet"/>
-        <w:spacing w:after="50" w:line="276" w:lineRule="auto"/>
-        <w:ind w:left="432"/>
-      </w:pPr>
-      <w:r>
-        <w:rPr>
-          <w:rFonts w:ascii="Calibri" w:hAnsi="Calibri"/>
-          <w:sz w:val="19"/>
-        </w:rPr>
-        <w:t>Collaborated with senior software engineers to translate Figma designs into pixel-perfect, highly responsive frontend components.</w:t>
-      </w:r>
-    </w:p>
-    <w:p>
-      <w:pPr>
-        <w:keepNext/>
-        <w:tabs>
-          <w:tab w:pos="10080" w:val="right"/>
-        </w:tabs>
-        <w:spacing w:before="120" w:after="20"/>
-      </w:pPr>
-      <w:r>
-        <w:rPr>
-          <w:rFonts w:ascii="Calibri" w:hAnsi="Calibri"/>
-          <w:b/>
-          <w:color w:val="1A365D"/>
-          <w:sz w:val="21"/>
-        </w:rPr>
-        <w:t>Independent Fullstack Developer</w:t>
-      </w:r>
-      <w:r>
-        <w:tab/>
-        <w:t>January 2024 – August 2024</w:t>
-      </w:r>
-    </w:p>
-    <w:p>
-      <w:pPr>
-        <w:keepNext/>
-        <w:tabs>
-          <w:tab w:pos="10080" w:val="right"/>
-        </w:tabs>
-        <w:spacing w:before="0" w:after="60"/>
-      </w:pPr>
-      <w:r>
-        <w:rPr>
-          <w:rFonts w:ascii="Calibri" w:hAnsi="Calibri"/>
-          <w:b/>
-          <w:color w:val="718096"/>
-          <w:sz w:val="19"/>
-        </w:rPr>
-        <w:t>AcadExpub</w:t>
+        <w:t>Ink and Armor</w:t>
       </w:r>
       <w:r>
         <w:tab/>
@@ -540,7 +430,7 @@
           <w:color w:val="2D3748"/>
           <w:sz w:val="18"/>
         </w:rPr>
-        <w:t>Next.js, TypeScript, Tailwind CSS, shadcn/ui, Firebase (Auth, Firestore, Storage)</w:t>
+        <w:t>Figma, Photoshop, Illustrator, WordPress, Web Design, Brand Design</w:t>
       </w:r>
     </w:p>
     <w:p>
@@ -554,7 +444,7 @@
           <w:rFonts w:ascii="Calibri" w:hAnsi="Calibri"/>
           <w:sz w:val="19"/>
         </w:rPr>
-        <w:t>Engineered and deployed a high-performance academic publishing and peer-distribution platform, centralizing educational material sharing.</w:t>
+        <w:t>Designed brand and marketing materials including logos, flyers, and social media graphics for a creative writing agency.</w:t>
       </w:r>
     </w:p>
     <w:p>
@@ -568,7 +458,7 @@
           <w:rFonts w:ascii="Calibri" w:hAnsi="Calibri"/>
           <w:sz w:val="19"/>
         </w:rPr>
-        <w:t>Architected a secure, multi-role authentication flow utilizing Firebase custom claims and Next.js middleware guards, enforcing absolute isolation between Student and Educator dashboard portals.</w:t>
+        <w:t>Currently developing the company website to establish a cohesive online presence for the agency.</w:t>
       </w:r>
     </w:p>
     <w:p>
@@ -582,7 +472,7 @@
           <w:rFonts w:ascii="Calibri" w:hAnsi="Calibri"/>
           <w:sz w:val="19"/>
         </w:rPr>
-        <w:t>Developed an optimized document upload and distribution pipeline with Firebase Storage and Cloud Firestore, incorporating drag-and-drop uploads, chunked transfer validation, and cryptographic tokenized secure access links.</w:t>
+        <w:t>Collaborated directly with the founder to translate brand vision into visual and web deliverables.</w:t>
       </w:r>
     </w:p>
     <w:p>
@@ -596,21 +486,7 @@
           <w:rFonts w:ascii="Calibri" w:hAnsi="Calibri"/>
           <w:sz w:val="19"/>
         </w:rPr>
-        <w:t>Designed a custom, interactive reference viewer and searchable archives catalog using React and shadcn/ui, offering educators instant material control.</w:t>
-      </w:r>
-    </w:p>
-    <w:p>
-      <w:pPr>
-        <w:pStyle w:val="ListBullet"/>
-        <w:spacing w:after="50" w:line="276" w:lineRule="auto"/>
-        <w:ind w:left="432"/>
-      </w:pPr>
-      <w:r>
-        <w:rPr>
-          <w:rFonts w:ascii="Calibri" w:hAnsi="Calibri"/>
-          <w:sz w:val="19"/>
-        </w:rPr>
-        <w:t>Fine-tuned Next.js App Router data-fetching methods and client-side caching, resulting in a 35% reduction in page load latency and seamless 60fps UI transitions.</w:t>
+        <w:t>Handled end-to-end creative production across print and digital formats using Figma, Photoshop, and Illustrator.</w:t>
       </w:r>
     </w:p>
     <w:p>
@@ -628,11 +504,135 @@
           <w:color w:val="1A365D"/>
           <w:sz w:val="21"/>
         </w:rPr>
-        <w:t>Contract Fullstack Engineer</w:t>
+        <w:t>Frontend Engineer Intern</w:t>
       </w:r>
       <w:r>
         <w:tab/>
-        <w:t>June 2023 – Present</w:t>
+        <w:t>January 2025 – May 2025</w:t>
+      </w:r>
+    </w:p>
+    <w:p>
+      <w:pPr>
+        <w:keepNext/>
+        <w:tabs>
+          <w:tab w:pos="10080" w:val="right"/>
+        </w:tabs>
+        <w:spacing w:before="0" w:after="60"/>
+      </w:pPr>
+      <w:r>
+        <w:rPr>
+          <w:rFonts w:ascii="Calibri" w:hAnsi="Calibri"/>
+          <w:b/>
+          <w:color w:val="718096"/>
+          <w:sz w:val="19"/>
+        </w:rPr>
+        <w:t>Tech Beavers</w:t>
+      </w:r>
+      <w:r>
+        <w:tab/>
+        <w:t>Abuja, Nigeria</w:t>
+      </w:r>
+    </w:p>
+    <w:p>
+      <w:pPr>
+        <w:spacing w:after="80"/>
+        <w:ind w:left="216"/>
+      </w:pPr>
+      <w:r>
+        <w:rPr>
+          <w:rFonts w:ascii="Calibri" w:hAnsi="Calibri"/>
+          <w:b/>
+          <w:i/>
+          <w:sz w:val="18"/>
+        </w:rPr>
+        <w:t xml:space="preserve">Technologies Utilized: </w:t>
+      </w:r>
+      <w:r>
+        <w:rPr>
+          <w:rFonts w:ascii="Calibri" w:hAnsi="Calibri"/>
+          <w:i/>
+          <w:color w:val="2D3748"/>
+          <w:sz w:val="18"/>
+        </w:rPr>
+        <w:t>React, Next.js, HTML, CSS, JavaScript, Git, GitHub</w:t>
+      </w:r>
+    </w:p>
+    <w:p>
+      <w:pPr>
+        <w:pStyle w:val="ListBullet"/>
+        <w:spacing w:after="50" w:line="276" w:lineRule="auto"/>
+        <w:ind w:left="432"/>
+      </w:pPr>
+      <w:r>
+        <w:rPr>
+          <w:rFonts w:ascii="Calibri" w:hAnsi="Calibri"/>
+          <w:sz w:val="19"/>
+        </w:rPr>
+        <w:t>Built and maintained frontend interfaces using React and Next.js, contributing to live product features across the internship period.</w:t>
+      </w:r>
+    </w:p>
+    <w:p>
+      <w:pPr>
+        <w:pStyle w:val="ListBullet"/>
+        <w:spacing w:after="50" w:line="276" w:lineRule="auto"/>
+        <w:ind w:left="432"/>
+      </w:pPr>
+      <w:r>
+        <w:rPr>
+          <w:rFonts w:ascii="Calibri" w:hAnsi="Calibri"/>
+          <w:sz w:val="19"/>
+        </w:rPr>
+        <w:t>Collaborated with a development team on sprint-based workflows, gaining hands-on experience with real codebase collaboration.</w:t>
+      </w:r>
+    </w:p>
+    <w:p>
+      <w:pPr>
+        <w:pStyle w:val="ListBullet"/>
+        <w:spacing w:after="50" w:line="276" w:lineRule="auto"/>
+        <w:ind w:left="432"/>
+      </w:pPr>
+      <w:r>
+        <w:rPr>
+          <w:rFonts w:ascii="Calibri" w:hAnsi="Calibri"/>
+          <w:sz w:val="19"/>
+        </w:rPr>
+        <w:t>Translated UI/UX designs into responsive, accessible components using HTML, CSS, and JavaScript.</w:t>
+      </w:r>
+    </w:p>
+    <w:p>
+      <w:pPr>
+        <w:pStyle w:val="ListBullet"/>
+        <w:spacing w:after="50" w:line="276" w:lineRule="auto"/>
+        <w:ind w:left="432"/>
+      </w:pPr>
+      <w:r>
+        <w:rPr>
+          <w:rFonts w:ascii="Calibri" w:hAnsi="Calibri"/>
+          <w:sz w:val="19"/>
+        </w:rPr>
+        <w:t>Received mentorship in professional frontend development practices and delivered assigned features within deadlines.</w:t>
+      </w:r>
+    </w:p>
+    <w:p>
+      <w:pPr>
+        <w:keepNext/>
+        <w:tabs>
+          <w:tab w:pos="10080" w:val="right"/>
+        </w:tabs>
+        <w:spacing w:before="120" w:after="20"/>
+      </w:pPr>
+      <w:r>
+        <w:rPr>
+          <w:rFonts w:ascii="Calibri" w:hAnsi="Calibri"/>
+          <w:b/>
+          <w:color w:val="1A365D"/>
+          <w:sz w:val="21"/>
+        </w:rPr>
+        <w:t>Fullstack Developer &amp; Automation Specialist (Fiverr &amp; Direct Clients)</w:t>
+      </w:r>
+      <w:r>
+        <w:tab/>
+        <w:t>2023 – Present</w:t>
       </w:r>
     </w:p>
     <w:p>
@@ -678,7 +678,7 @@
           <w:color w:val="2D3748"/>
           <w:sz w:val="18"/>
         </w:rPr>
-        <w:t>Next.js, React Native, Expo, Node.js, Express.js, Firebase, n8n, GoHighLevel, Figma</w:t>
+        <w:t>Next.js, React Native, Node.js, WordPress, Wix, GoHighLevel, n8n, Zapier</w:t>
       </w:r>
     </w:p>
     <w:p>
@@ -692,7 +692,7 @@
           <w:rFonts w:ascii="Calibri" w:hAnsi="Calibri"/>
           <w:sz w:val="19"/>
         </w:rPr>
-        <w:t>Architect and deploy custom, production-grade web and mobile applications for international clients, utilizing Next.js, React Native, Node.js, and Supabase / Firebase architectures.</w:t>
+        <w:t>Delivered 15+ client projects across web development, CRM automation, and funnel design over 3 years of independent practice.</w:t>
       </w:r>
     </w:p>
     <w:p>
@@ -706,7 +706,7 @@
           <w:rFonts w:ascii="Calibri" w:hAnsi="Calibri"/>
           <w:sz w:val="19"/>
         </w:rPr>
-        <w:t>Design and construct complex AI-powered workflows and multi-branch automation pipelines using n8n, Zapier, and Python scripts, optimizing client workflow speed by up to 50%.</w:t>
+        <w:t>Designed and delivered custom websites for clients via Fiverr, covering landing pages, portfolios, and business sites using Next.js, WordPress, and Wix.</w:t>
       </w:r>
     </w:p>
     <w:p>
@@ -720,7 +720,7 @@
           <w:rFonts w:ascii="Calibri" w:hAnsi="Calibri"/>
           <w:sz w:val="19"/>
         </w:rPr>
-        <w:t>Orchestrate complete product lifecycles, covering user research, Figma wireframing, frontend development, relational database schemas, and GoHighLevel CRM integration.</w:t>
+        <w:t>Built lead capture and CRM automation pipelines using GoHighLevel, n8n, and Zapier — handling everything from funnel design to email/SMS qualification sequences.</w:t>
       </w:r>
     </w:p>
     <w:p>
@@ -734,7 +734,21 @@
           <w:rFonts w:ascii="Calibri" w:hAnsi="Calibri"/>
           <w:sz w:val="19"/>
         </w:rPr>
-        <w:t>Consult on SEO strategies, performance tuning, and high-converting marketing funnels to scale user acquisition and digital conversions.</w:t>
+        <w:t>Designed and deployed sales funnels for clients, integrating lead generation flows with CRM tools and automated follow-up systems.</w:t>
+      </w:r>
+    </w:p>
+    <w:p>
+      <w:pPr>
+        <w:pStyle w:val="ListBullet"/>
+        <w:spacing w:after="50" w:line="276" w:lineRule="auto"/>
+        <w:ind w:left="432"/>
+      </w:pPr>
+      <w:r>
+        <w:rPr>
+          <w:rFonts w:ascii="Calibri" w:hAnsi="Calibri"/>
+          <w:sz w:val="19"/>
+        </w:rPr>
+        <w:t>Managed end-to-end client delivery independently — from scoping and design to handoff — across multiple concurrent projects.</w:t>
       </w:r>
     </w:p>
     <w:p>

</xml_diff>